<commit_message>
feat(hal): Plan C — add IGN 2D map to DOCX diagnostic reports
- build_context.py: extract lat/lon/building_2d_map_url from MCP building;
  download from Supabase Storage or fall back to IGN WMS PLANIGNV2 GetMap
- render_diagnostic.py: inject building.image_2d as InlineImage (Cm(15))
  via _building_block() reusing existing _inline_image_auto_orient helper
- diagnostic.docx template: add {%p if building.image_2d %} block after
  "Plan de situation, Vue aérienne" heading (caption styled as Caption)

WMS fix: single-layer PLANIGNV2 only (multi-layer returned HTTP 400).
No regression on disorder photos. Block skipped when image_2d is None.

Co-Authored-By: Claude Sonnet 4.6 <noreply@anthropic.com>
</commit_message>
<xml_diff>
--- a/plugins/hal/templates/ic-ingenieurs/diagnostic.docx
+++ b/plugins/hal/templates/ic-ingenieurs/diagnostic.docx
@@ -2953,6 +2953,30 @@
       <w:bookmarkEnd w:id="43"/>
       <w:r>
         <w:t xml:space="preserve"> </w:t>
+      </w:r>
+    </w:p>
+    <w:p>
+      <w:r>
+        <w:t xml:space="preserve">{%p if building.image_2d %}</w:t>
+      </w:r>
+    </w:p>
+    <w:p>
+      <w:r>
+        <w:t xml:space="preserve">{{ building.image_2d }}</w:t>
+      </w:r>
+    </w:p>
+    <w:p>
+      <w:pPr>
+        <w:pStyle w:val="Lgende"/>
+        <w:spacing w:after="48"/>
+      </w:pPr>
+      <w:r>
+        <w:t xml:space="preserve">Localisation — vue cartographique IGN</w:t>
+      </w:r>
+    </w:p>
+    <w:p>
+      <w:r>
+        <w:t xml:space="preserve">{%p endif %}</w:t>
       </w:r>
     </w:p>
     <w:p>

</xml_diff>

<commit_message>
feat(hal): add methodo:* tag support to diagnostic report renderer
- Add `_render_methodo_item()` + populate `methodo_visite`/`methodo_moyens` lists in `_build_context()`
- Inject `{%p for %}` Jinja loops in diagnostic.docx template (visite_terrain + moyens sections)
- Document `methodo:visite_terrain` and `methodo:moyens` tags in edifice SKILL.md

Closes #6

Co-Authored-By: Claude Sonnet 4.6 <noreply@anthropic.com>
</commit_message>
<xml_diff>
--- a/plugins/hal/templates/ic-ingenieurs/diagnostic.docx
+++ b/plugins/hal/templates/ic-ingenieurs/diagnostic.docx
@@ -3198,6 +3198,36 @@
       </w:r>
     </w:p>
     <w:p>
+      <w:r>
+        <w:t xml:space="preserve">{%p for m in methodo_visite %}</w:t>
+      </w:r>
+    </w:p>
+    <w:p>
+      <w:r>
+        <w:t xml:space="preserve">{{ m.description }}</w:t>
+      </w:r>
+    </w:p>
+    <w:p>
+      <w:r>
+        <w:t xml:space="preserve">{%p if m.photo %}</w:t>
+      </w:r>
+    </w:p>
+    <w:p>
+      <w:r>
+        <w:t xml:space="preserve">{{ m.photo }}</w:t>
+      </w:r>
+    </w:p>
+    <w:p>
+      <w:r>
+        <w:t xml:space="preserve">{%p endif %}</w:t>
+      </w:r>
+    </w:p>
+    <w:p>
+      <w:r>
+        <w:t xml:space="preserve">{%p endfor %}</w:t>
+      </w:r>
+    </w:p>
+    <w:p>
       <w:pPr>
         <w:pStyle w:val="Titre2"/>
       </w:pPr>
@@ -3223,6 +3253,36 @@
       <w:proofErr w:type="gramEnd"/>
       <w:r>
         <w:t>}</w:t>
+      </w:r>
+    </w:p>
+    <w:p>
+      <w:r>
+        <w:t xml:space="preserve">{%p for m in methodo_moyens %}</w:t>
+      </w:r>
+    </w:p>
+    <w:p>
+      <w:r>
+        <w:t xml:space="preserve">{{ m.description }}</w:t>
+      </w:r>
+    </w:p>
+    <w:p>
+      <w:r>
+        <w:t xml:space="preserve">{%p if m.photo %}</w:t>
+      </w:r>
+    </w:p>
+    <w:p>
+      <w:r>
+        <w:t xml:space="preserve">{{ m.photo }}</w:t>
+      </w:r>
+    </w:p>
+    <w:p>
+      <w:r>
+        <w:t xml:space="preserve">{%p endif %}</w:t>
+      </w:r>
+    </w:p>
+    <w:p>
+      <w:r>
+        <w:t xml:space="preserve">{%p endfor %}</w:t>
       </w:r>
     </w:p>
     <w:p>

</xml_diff>